<commit_message>
change form to use flask wtf fields, add new fields to docx template
</commit_message>
<xml_diff>
--- a/src/doc_creation/заявление_сктс_шаблон.docx
+++ b/src/doc_creation/заявление_сктс_шаблон.docx
@@ -1081,6 +1081,105 @@
                 <w:szCs w:val="21"/>
               </w:rPr>
             </w:pPr>
+            <w:proofErr w:type="gramStart"/>
+            <w:r>
+              <w:rPr>
+                <w:sz w:val="21"/>
+                <w:szCs w:val="21"/>
+              </w:rPr>
+              <w:t xml:space="preserve">{{ </w:t>
+            </w:r>
+            <w:proofErr w:type="spellStart"/>
+            <w:r>
+              <w:rPr>
+                <w:sz w:val="21"/>
+                <w:szCs w:val="21"/>
+              </w:rPr>
+              <w:t>собственник</w:t>
+            </w:r>
+            <w:proofErr w:type="gramEnd"/>
+            <w:r>
+              <w:rPr>
+                <w:sz w:val="21"/>
+                <w:szCs w:val="21"/>
+              </w:rPr>
+              <w:t>_ТС_имя</w:t>
+            </w:r>
+            <w:proofErr w:type="spellEnd"/>
+            <w:r>
+              <w:rPr>
+                <w:sz w:val="21"/>
+                <w:szCs w:val="21"/>
+              </w:rPr>
+              <w:t xml:space="preserve"> }} </w:t>
+            </w:r>
+            <w:r>
+              <w:rPr>
+                <w:sz w:val="21"/>
+                <w:szCs w:val="21"/>
+              </w:rPr>
+              <w:t xml:space="preserve">{{ </w:t>
+            </w:r>
+            <w:proofErr w:type="spellStart"/>
+            <w:r>
+              <w:rPr>
+                <w:sz w:val="21"/>
+                <w:szCs w:val="21"/>
+              </w:rPr>
+              <w:t>собственник_ТС_</w:t>
+            </w:r>
+            <w:r>
+              <w:rPr>
+                <w:sz w:val="21"/>
+                <w:szCs w:val="21"/>
+              </w:rPr>
+              <w:t>фамилия</w:t>
+            </w:r>
+            <w:proofErr w:type="spellEnd"/>
+            <w:r>
+              <w:rPr>
+                <w:sz w:val="21"/>
+                <w:szCs w:val="21"/>
+              </w:rPr>
+              <w:t xml:space="preserve"> }}</w:t>
+            </w:r>
+            <w:r>
+              <w:rPr>
+                <w:sz w:val="21"/>
+                <w:szCs w:val="21"/>
+              </w:rPr>
+              <w:t xml:space="preserve"> </w:t>
+            </w:r>
+            <w:r>
+              <w:rPr>
+                <w:sz w:val="21"/>
+                <w:szCs w:val="21"/>
+              </w:rPr>
+              <w:t xml:space="preserve">{{ </w:t>
+            </w:r>
+            <w:proofErr w:type="spellStart"/>
+            <w:r>
+              <w:rPr>
+                <w:sz w:val="21"/>
+                <w:szCs w:val="21"/>
+              </w:rPr>
+              <w:t>собственник_ТС_</w:t>
+            </w:r>
+            <w:r>
+              <w:rPr>
+                <w:sz w:val="21"/>
+                <w:szCs w:val="21"/>
+              </w:rPr>
+              <w:t>отчество</w:t>
+            </w:r>
+            <w:proofErr w:type="spellEnd"/>
+            <w:r>
+              <w:rPr>
+                <w:sz w:val="21"/>
+                <w:szCs w:val="21"/>
+              </w:rPr>
+              <w:t xml:space="preserve"> }}</w:t>
+            </w:r>
           </w:p>
         </w:tc>
         <w:tc>
@@ -1211,8 +1310,35 @@
               <w:rPr>
                 <w:sz w:val="21"/>
                 <w:szCs w:val="21"/>
-              </w:rPr>
-            </w:pPr>
+                <w:lang w:val="en-US"/>
+              </w:rPr>
+            </w:pPr>
+            <w:r>
+              <w:rPr>
+                <w:sz w:val="21"/>
+                <w:szCs w:val="21"/>
+                <w:lang w:val="en-US"/>
+              </w:rPr>
+              <w:t xml:space="preserve">{{ </w:t>
+            </w:r>
+            <w:proofErr w:type="spellStart"/>
+            <w:r>
+              <w:rPr>
+                <w:sz w:val="21"/>
+                <w:szCs w:val="21"/>
+                <w:lang w:val="en-US"/>
+              </w:rPr>
+              <w:t>дата_рождения</w:t>
+            </w:r>
+            <w:proofErr w:type="spellEnd"/>
+            <w:r>
+              <w:rPr>
+                <w:sz w:val="21"/>
+                <w:szCs w:val="21"/>
+                <w:lang w:val="en-US"/>
+              </w:rPr>
+              <w:t xml:space="preserve"> }}</w:t>
+            </w:r>
           </w:p>
         </w:tc>
         <w:tc>
@@ -1311,8 +1437,35 @@
               <w:rPr>
                 <w:sz w:val="21"/>
                 <w:szCs w:val="21"/>
-              </w:rPr>
-            </w:pPr>
+                <w:lang w:val="en-US"/>
+              </w:rPr>
+            </w:pPr>
+            <w:r>
+              <w:rPr>
+                <w:sz w:val="21"/>
+                <w:szCs w:val="21"/>
+                <w:lang w:val="en-US"/>
+              </w:rPr>
+              <w:t xml:space="preserve">{{ </w:t>
+            </w:r>
+            <w:proofErr w:type="spellStart"/>
+            <w:r>
+              <w:rPr>
+                <w:sz w:val="21"/>
+                <w:szCs w:val="21"/>
+                <w:lang w:val="en-US"/>
+              </w:rPr>
+              <w:t>паспорт_собственник</w:t>
+            </w:r>
+            <w:proofErr w:type="spellEnd"/>
+            <w:r>
+              <w:rPr>
+                <w:sz w:val="21"/>
+                <w:szCs w:val="21"/>
+                <w:lang w:val="en-US"/>
+              </w:rPr>
+              <w:t xml:space="preserve"> }}</w:t>
+            </w:r>
           </w:p>
         </w:tc>
         <w:tc>
@@ -1384,8 +1537,34 @@
               <w:rPr>
                 <w:sz w:val="21"/>
                 <w:szCs w:val="21"/>
-              </w:rPr>
-            </w:pPr>
+                <w:lang w:val="en-US"/>
+              </w:rPr>
+            </w:pPr>
+            <w:r>
+              <w:rPr>
+                <w:sz w:val="21"/>
+                <w:szCs w:val="21"/>
+                <w:lang w:val="en-US"/>
+              </w:rPr>
+              <w:t xml:space="preserve">{{ </w:t>
+            </w:r>
+            <w:proofErr w:type="spellStart"/>
+            <w:r>
+              <w:rPr>
+                <w:sz w:val="21"/>
+                <w:szCs w:val="21"/>
+              </w:rPr>
+              <w:t>инн</w:t>
+            </w:r>
+            <w:proofErr w:type="spellEnd"/>
+            <w:r>
+              <w:rPr>
+                <w:sz w:val="21"/>
+                <w:szCs w:val="21"/>
+                <w:lang w:val="en-US"/>
+              </w:rPr>
+              <w:t xml:space="preserve"> }}</w:t>
+            </w:r>
           </w:p>
         </w:tc>
         <w:tc>
@@ -1469,6 +1648,7 @@
               <w:rPr>
                 <w:sz w:val="21"/>
                 <w:szCs w:val="21"/>
+                <w:lang w:val="en-US"/>
               </w:rPr>
             </w:pPr>
           </w:p>
@@ -1533,6 +1713,34 @@
                 <w:szCs w:val="21"/>
               </w:rPr>
             </w:pPr>
+            <w:r>
+              <w:rPr>
+                <w:sz w:val="21"/>
+                <w:szCs w:val="21"/>
+                <w:lang w:val="en-US"/>
+              </w:rPr>
+              <w:t xml:space="preserve">{{ </w:t>
+            </w:r>
+            <w:proofErr w:type="spellStart"/>
+            <w:r>
+              <w:rPr>
+                <w:sz w:val="21"/>
+                <w:szCs w:val="21"/>
+                <w:lang w:val="en-US"/>
+              </w:rPr>
+              <w:t>адрес_регистрации</w:t>
+            </w:r>
+            <w:proofErr w:type="spellEnd"/>
+            <w:r>
+              <w:rPr>
+                <w:sz w:val="21"/>
+                <w:szCs w:val="21"/>
+                <w:lang w:val="en-US"/>
+              </w:rPr>
+              <w:t xml:space="preserve"> }}</w:t>
+            </w:r>
+            <w:bookmarkStart w:id="0" w:name="_GoBack"/>
+            <w:bookmarkEnd w:id="0"/>
           </w:p>
         </w:tc>
         <w:tc>
@@ -1898,8 +2106,6 @@
               </w:rPr>
               <w:t>}}</w:t>
             </w:r>
-            <w:bookmarkStart w:id="0" w:name="_GoBack"/>
-            <w:bookmarkEnd w:id="0"/>
           </w:p>
         </w:tc>
         <w:tc>

</xml_diff>

<commit_message>
display validation errors on form fields
</commit_message>
<xml_diff>
--- a/src/doc_creation/заявление_сктс_шаблон.docx
+++ b/src/doc_creation/заявление_сктс_шаблон.docx
@@ -140,46 +140,14 @@
               <w:rPr>
                 <w:sz w:val="24"/>
                 <w:szCs w:val="24"/>
-                <w:lang w:val="en-US"/>
-              </w:rPr>
-            </w:pPr>
-            <w:r>
-              <w:rPr>
-                <w:sz w:val="24"/>
-                <w:szCs w:val="24"/>
-                <w:lang w:val="en-US"/>
-              </w:rPr>
-              <w:t xml:space="preserve">{{ </w:t>
-            </w:r>
-            <w:r>
-              <w:rPr>
-                <w:sz w:val="24"/>
-                <w:szCs w:val="24"/>
-              </w:rPr>
-              <w:t>наименование</w:t>
-            </w:r>
-            <w:r>
-              <w:rPr>
-                <w:sz w:val="24"/>
-                <w:szCs w:val="24"/>
-                <w:lang w:val="en-US"/>
-              </w:rPr>
-              <w:t>_</w:t>
-            </w:r>
-            <w:r>
-              <w:rPr>
-                <w:sz w:val="24"/>
-                <w:szCs w:val="24"/>
-              </w:rPr>
-              <w:t>подразделения</w:t>
-            </w:r>
-            <w:r>
-              <w:rPr>
-                <w:sz w:val="24"/>
-                <w:szCs w:val="24"/>
-                <w:lang w:val="en-US"/>
-              </w:rPr>
-              <w:t xml:space="preserve"> }}</w:t>
+              </w:rPr>
+            </w:pPr>
+            <w:r>
+              <w:rPr>
+                <w:sz w:val="24"/>
+                <w:szCs w:val="24"/>
+              </w:rPr>
+              <w:t>УГИБДД МВД по Республике Дагестан</w:t>
             </w:r>
           </w:p>
         </w:tc>
@@ -328,20 +296,12 @@
                 <w:szCs w:val="24"/>
               </w:rPr>
             </w:pPr>
-            <w:proofErr w:type="gramStart"/>
-            <w:r>
-              <w:rPr>
-                <w:sz w:val="24"/>
-                <w:szCs w:val="24"/>
-              </w:rPr>
-              <w:t>{{</w:t>
-            </w:r>
-            <w:r>
-              <w:rPr>
-                <w:sz w:val="24"/>
-                <w:szCs w:val="24"/>
-              </w:rPr>
-              <w:t xml:space="preserve"> </w:t>
+            <w:r>
+              <w:rPr>
+                <w:sz w:val="24"/>
+                <w:szCs w:val="24"/>
+              </w:rPr>
+              <w:t xml:space="preserve">Исаев </w:t>
             </w:r>
             <w:proofErr w:type="spellStart"/>
             <w:r>
@@ -349,15 +309,7 @@
                 <w:sz w:val="24"/>
                 <w:szCs w:val="24"/>
               </w:rPr>
-              <w:t>ФИО</w:t>
-            </w:r>
-            <w:proofErr w:type="gramEnd"/>
-            <w:r>
-              <w:rPr>
-                <w:sz w:val="24"/>
-                <w:szCs w:val="24"/>
-              </w:rPr>
-              <w:t>_заявителя</w:t>
+              <w:t>Мурад</w:t>
             </w:r>
             <w:proofErr w:type="spellEnd"/>
             <w:r>
@@ -365,14 +317,7 @@
                 <w:sz w:val="24"/>
                 <w:szCs w:val="24"/>
               </w:rPr>
-              <w:t xml:space="preserve"> </w:t>
-            </w:r>
-            <w:r>
-              <w:rPr>
-                <w:sz w:val="24"/>
-                <w:szCs w:val="24"/>
-              </w:rPr>
-              <w:t>}}</w:t>
+              <w:t xml:space="preserve"> Маратович</w:t>
             </w:r>
           </w:p>
         </w:tc>
@@ -1111,14 +1056,7 @@
                 <w:sz w:val="21"/>
                 <w:szCs w:val="21"/>
               </w:rPr>
-              <w:t xml:space="preserve"> }} </w:t>
-            </w:r>
-            <w:r>
-              <w:rPr>
-                <w:sz w:val="21"/>
-                <w:szCs w:val="21"/>
-              </w:rPr>
-              <w:t xml:space="preserve">{{ </w:t>
+              <w:t xml:space="preserve"> }} {{ </w:t>
             </w:r>
             <w:proofErr w:type="spellStart"/>
             <w:r>
@@ -1126,14 +1064,7 @@
                 <w:sz w:val="21"/>
                 <w:szCs w:val="21"/>
               </w:rPr>
-              <w:t>собственник_ТС_</w:t>
-            </w:r>
-            <w:r>
-              <w:rPr>
-                <w:sz w:val="21"/>
-                <w:szCs w:val="21"/>
-              </w:rPr>
-              <w:t>фамилия</w:t>
+              <w:t>собственник_ТС_фамилия</w:t>
             </w:r>
             <w:proofErr w:type="spellEnd"/>
             <w:r>
@@ -1141,21 +1072,7 @@
                 <w:sz w:val="21"/>
                 <w:szCs w:val="21"/>
               </w:rPr>
-              <w:t xml:space="preserve"> }}</w:t>
-            </w:r>
-            <w:r>
-              <w:rPr>
-                <w:sz w:val="21"/>
-                <w:szCs w:val="21"/>
-              </w:rPr>
-              <w:t xml:space="preserve"> </w:t>
-            </w:r>
-            <w:r>
-              <w:rPr>
-                <w:sz w:val="21"/>
-                <w:szCs w:val="21"/>
-              </w:rPr>
-              <w:t xml:space="preserve">{{ </w:t>
+              <w:t xml:space="preserve"> }} {{ </w:t>
             </w:r>
             <w:proofErr w:type="spellStart"/>
             <w:r>
@@ -1163,14 +1080,7 @@
                 <w:sz w:val="21"/>
                 <w:szCs w:val="21"/>
               </w:rPr>
-              <w:t>собственник_ТС_</w:t>
-            </w:r>
-            <w:r>
-              <w:rPr>
-                <w:sz w:val="21"/>
-                <w:szCs w:val="21"/>
-              </w:rPr>
-              <w:t>отчество</w:t>
+              <w:t>собственник_ТС_отчество</w:t>
             </w:r>
             <w:proofErr w:type="spellEnd"/>
             <w:r>
@@ -1648,7 +1558,6 @@
               <w:rPr>
                 <w:sz w:val="21"/>
                 <w:szCs w:val="21"/>
-                <w:lang w:val="en-US"/>
               </w:rPr>
             </w:pPr>
           </w:p>
@@ -1739,8 +1648,6 @@
               </w:rPr>
               <w:t xml:space="preserve"> }}</w:t>
             </w:r>
-            <w:bookmarkStart w:id="0" w:name="_GoBack"/>
-            <w:bookmarkEnd w:id="0"/>
           </w:p>
         </w:tc>
         <w:tc>
@@ -2067,13 +1974,12 @@
                 <w:szCs w:val="21"/>
               </w:rPr>
             </w:pPr>
-            <w:proofErr w:type="gramStart"/>
-            <w:r>
-              <w:rPr>
-                <w:sz w:val="21"/>
-                <w:szCs w:val="21"/>
-              </w:rPr>
-              <w:t xml:space="preserve">{{ </w:t>
+            <w:r>
+              <w:rPr>
+                <w:sz w:val="21"/>
+                <w:szCs w:val="21"/>
+              </w:rPr>
+              <w:t xml:space="preserve">Исаев </w:t>
             </w:r>
             <w:proofErr w:type="spellStart"/>
             <w:r>
@@ -2081,15 +1987,7 @@
                 <w:sz w:val="21"/>
                 <w:szCs w:val="21"/>
               </w:rPr>
-              <w:t>ФИО</w:t>
-            </w:r>
-            <w:proofErr w:type="gramEnd"/>
-            <w:r>
-              <w:rPr>
-                <w:sz w:val="21"/>
-                <w:szCs w:val="21"/>
-              </w:rPr>
-              <w:t>_представителя_собственника</w:t>
+              <w:t>Мурад</w:t>
             </w:r>
             <w:proofErr w:type="spellEnd"/>
             <w:r>
@@ -2097,14 +1995,7 @@
                 <w:sz w:val="21"/>
                 <w:szCs w:val="21"/>
               </w:rPr>
-              <w:t xml:space="preserve"> </w:t>
-            </w:r>
-            <w:r>
-              <w:rPr>
-                <w:sz w:val="21"/>
-                <w:szCs w:val="21"/>
-              </w:rPr>
-              <w:t>}}</w:t>
+              <w:t xml:space="preserve"> Маратович</w:t>
             </w:r>
           </w:p>
         </w:tc>
@@ -2247,22 +2138,25 @@
                 <w:szCs w:val="21"/>
                 <w:lang w:val="en-US"/>
               </w:rPr>
-              <w:t xml:space="preserve">{{ </w:t>
-            </w:r>
-            <w:r>
-              <w:rPr>
-                <w:sz w:val="21"/>
-                <w:szCs w:val="21"/>
-              </w:rPr>
-              <w:t xml:space="preserve">Паспорт </w:t>
-            </w:r>
+              <w:t xml:space="preserve">8218 055323, 11.04.2018, МВД </w:t>
+            </w:r>
+            <w:proofErr w:type="spellStart"/>
             <w:r>
               <w:rPr>
                 <w:sz w:val="21"/>
                 <w:szCs w:val="21"/>
                 <w:lang w:val="en-US"/>
               </w:rPr>
-              <w:t>}}</w:t>
+              <w:t>по</w:t>
+            </w:r>
+            <w:proofErr w:type="spellEnd"/>
+            <w:r>
+              <w:rPr>
+                <w:sz w:val="21"/>
+                <w:szCs w:val="21"/>
+                <w:lang w:val="en-US"/>
+              </w:rPr>
+              <w:t xml:space="preserve"> Р.Д.</w:t>
             </w:r>
           </w:p>
         </w:tc>
@@ -2413,24 +2307,58 @@
               <w:rPr>
                 <w:sz w:val="21"/>
                 <w:szCs w:val="21"/>
+              </w:rPr>
+              <w:t xml:space="preserve">Р.Д. </w:t>
+            </w:r>
+            <w:proofErr w:type="spellStart"/>
+            <w:r>
+              <w:rPr>
+                <w:sz w:val="21"/>
+                <w:szCs w:val="21"/>
+              </w:rPr>
+              <w:t>Казбековский</w:t>
+            </w:r>
+            <w:proofErr w:type="spellEnd"/>
+            <w:r>
+              <w:rPr>
+                <w:sz w:val="21"/>
+                <w:szCs w:val="21"/>
+              </w:rPr>
+              <w:t xml:space="preserve"> р-н, с. </w:t>
+            </w:r>
+            <w:proofErr w:type="spellStart"/>
+            <w:r>
+              <w:rPr>
+                <w:sz w:val="21"/>
+                <w:szCs w:val="21"/>
+              </w:rPr>
+              <w:t>Хубар</w:t>
+            </w:r>
+            <w:proofErr w:type="spellEnd"/>
+            <w:r>
+              <w:rPr>
+                <w:sz w:val="21"/>
+                <w:szCs w:val="21"/>
+              </w:rPr>
+              <w:t xml:space="preserve">, ул. </w:t>
+            </w:r>
+            <w:proofErr w:type="spellStart"/>
+            <w:r>
+              <w:rPr>
+                <w:sz w:val="21"/>
+                <w:szCs w:val="21"/>
                 <w:lang w:val="en-US"/>
               </w:rPr>
-              <w:t xml:space="preserve">{{ </w:t>
-            </w:r>
-            <w:r>
-              <w:rPr>
-                <w:sz w:val="21"/>
-                <w:szCs w:val="21"/>
-              </w:rPr>
-              <w:t>Адрес</w:t>
-            </w:r>
+              <w:t>Махачева</w:t>
+            </w:r>
+            <w:proofErr w:type="spellEnd"/>
             <w:r>
               <w:rPr>
                 <w:sz w:val="21"/>
                 <w:szCs w:val="21"/>
                 <w:lang w:val="en-US"/>
               </w:rPr>
-              <w:t xml:space="preserve"> }}</w:t>
+              <w:t>, д. 22</w:t>
             </w:r>
           </w:p>
         </w:tc>
@@ -2782,25 +2710,18 @@
                 <w:szCs w:val="21"/>
                 <w:lang w:val="en-US"/>
               </w:rPr>
-              <w:t xml:space="preserve">{{ </w:t>
+              <w:t xml:space="preserve">М. М. </w:t>
             </w:r>
             <w:proofErr w:type="spellStart"/>
             <w:r>
               <w:rPr>
                 <w:sz w:val="21"/>
                 <w:szCs w:val="21"/>
-              </w:rPr>
-              <w:t>инициалы_и_фамилия</w:t>
+                <w:lang w:val="en-US"/>
+              </w:rPr>
+              <w:t>Исаев</w:t>
             </w:r>
             <w:proofErr w:type="spellEnd"/>
-            <w:r>
-              <w:rPr>
-                <w:sz w:val="21"/>
-                <w:szCs w:val="21"/>
-                <w:lang w:val="en-US"/>
-              </w:rPr>
-              <w:t xml:space="preserve"> }}</w:t>
-            </w:r>
           </w:p>
         </w:tc>
         <w:tc>
@@ -3218,6 +3139,8 @@
           <w:szCs w:val="12"/>
         </w:rPr>
       </w:pPr>
+      <w:bookmarkStart w:id="0" w:name="_GoBack"/>
+      <w:bookmarkEnd w:id="0"/>
     </w:p>
     <w:tbl>
       <w:tblPr>

</xml_diff>